<commit_message>
Update form with official Investigador Adjunto 1 profile (AGH-ML-01-E-01)
Co-Authored-By: Claude Opus 5.5 <noreply@anthropic.com>
Claude-Session: https://claude.ai/code/session_01NDtWC7eXkDWbY5Gj4trG49
</commit_message>
<xml_diff>
--- a/Requerimiento_Personal_Investigador_Adjunto1_ARestrepo.docx
+++ b/Requerimiento_Personal_Investigador_Adjunto1_ARestrepo.docx
@@ -1054,7 +1054,7 @@
               </w:rPr>
             </w:pPr>
             <w:r>
-              <w:t>Sede Bogotá [POR CONFIRMAR]</w:t>
+              <w:t>Sede Bogotá</w:t>
             </w:r>
           </w:p>
         </w:tc>
@@ -1463,7 +1463,7 @@
           <w:szCs w:val="22"/>
           <w:lang w:val="es-CO"/>
         </w:rPr>
-        <w:t>Formación académica: Profesional en Biología, Ecología o áreas afines, con posgrado (maestría) en Ciencias Biológicas, Ecología, Conservación o afines. [POR CONFIRMAR]</w:t>
+        <w:t>Formación académica: Profesional en ciencias biológicas, ciencias de la tierra y medioambientales, ciencias físicas, matemáticas, computación y ciencias de la información u otras ciencias naturales; ingeniería ambiental, agronómica u otras ingenierías; ciencias agrícolas; economía, geografía social y económica, ciencias de la educación, comunicaciones u otras ciencias sociales; humanidades o áreas afines. Maestría en áreas relacionadas con el objeto del cargo. Equivalencia: cuatro (4) años de experiencia relacionada con el objeto del cargo, adicionales a los mínimos requeridos.</w:t>
       </w:r>
     </w:p>
     <w:p>
@@ -1488,7 +1488,7 @@
           <w:szCs w:val="22"/>
           <w:lang w:val="es-CO"/>
         </w:rPr>
-        <w:t>Experiencia: Mínimo [X] años de experiencia profesional relacionada, incluyendo diseño e implementación de estrategias de monitoreo de biodiversidad, coordinación de proyectos y supervisión de contratos. [POR CONFIRMAR]</w:t>
+        <w:t>Experiencia: Cuatro (4) años de experiencia en la planificación, ejecución y análisis de proyectos de investigación en entidades públicas o privadas, en gestión de proyectos en materia de conservación de biodiversidad, gestión de recursos naturales, gestión ambiental, gestión del desarrollo o desarrollo sectorial.</w:t>
       </w:r>
     </w:p>
     <w:p>
@@ -1513,7 +1513,7 @@
           <w:szCs w:val="22"/>
           <w:lang w:val="es-CO"/>
         </w:rPr>
-        <w:t>Conocimientos: Diseño de programas de monitoreo de biodiversidad; análisis y modelamiento de datos ecológicos; formulación, seguimiento y cierre de proyectos y convenios; elaboración de términos de referencia e informes técnicos. [POR CONFIRMAR]</w:t>
+        <w:t>Conocimientos: Métodos y técnicas de investigación y análisis de datos; políticas y regulaciones ambientales relevantes; gestión, seguimiento y evaluación de proyectos; estado actual del tema ambiental a nivel nacional y mundial; manejo de equipos de cómputo, herramientas ofimáticas (Word, Excel, PowerPoint) y herramientas de internet.</w:t>
       </w:r>
     </w:p>
     <w:p>
@@ -1538,7 +1538,7 @@
           <w:szCs w:val="22"/>
           <w:lang w:val="es-CO"/>
         </w:rPr>
-        <w:t>Idiomas: Inglés nivel [B1/B2] (lectura técnica y comunicación escrita). [POR CONFIRMAR]</w:t>
+        <w:t>Idiomas: Inglés – lectura, escritura y conversación nivel medio.</w:t>
       </w:r>
     </w:p>
     <w:p>
@@ -1563,7 +1563,7 @@
           <w:szCs w:val="22"/>
           <w:lang w:val="es-CO"/>
         </w:rPr>
-        <w:t>Competencias: Trabajo en equipo e interdisciplinario, planificación y organización, comunicación asertiva, orientación a resultados, pensamiento analítico y relacionamiento con actores institucionales.</w:t>
+        <w:t>Competencias: Institucionales: creatividad e innovación, trabajo en equipo, orientación a resultados, coherencia, identificación con el Instituto. Por funciones y responsabilidades: comunicación efectiva, aprendizaje continuo, orientación a la calidad. Específicas del cargo: determinadas por el jefe inmediato y la Gerencia de Gestión Humana.</w:t>
       </w:r>
     </w:p>
     <w:p>
@@ -1635,7 +1635,7 @@
           <w:szCs w:val="22"/>
           <w:lang w:val="es-CO" w:eastAsia="es-MX"/>
         </w:rPr>
-        <w:t>Participar en el diseño, implementación y evaluación de estrategias de monitoreo de la biodiversidad, según lineamientos institucionales, en el marco del proyecto ANH. [POR CONFIRMAR]</w:t>
+        <w:t>Gestionar los proyectos de investigación que le sean asignados en el marco del proyecto ANH, incluyendo la planificación, ejecución y análisis de estudios de campo y de laboratorio, proponiendo objetivos, metas y la generación de nuevo conocimiento.</w:t>
       </w:r>
     </w:p>
     <w:p>
@@ -1707,7 +1707,7 @@
           <w:szCs w:val="22"/>
           <w:lang w:val="es-CO"/>
         </w:rPr>
-        <w:t>Coordinar los proyectos que le sean asignados.</w:t>
+        <w:t>Gestionar los proyectos de investigación asignados.</w:t>
       </w:r>
     </w:p>
     <w:p>
@@ -1734,7 +1734,7 @@
           <w:szCs w:val="22"/>
           <w:lang w:val="es-CO"/>
         </w:rPr>
-        <w:t>Supervisar los contratos que le sean asignados.</w:t>
+        <w:t>Establecer redes de colaboración con investigadores del Instituto y de otras entidades del orden nacional e internacional.</w:t>
       </w:r>
     </w:p>
     <w:p>
@@ -1761,7 +1761,7 @@
           <w:szCs w:val="22"/>
           <w:lang w:val="es-CO"/>
         </w:rPr>
-        <w:t>Participar activamente en las reuniones periódicas de seguimiento a los proyectos asignados, o en las que se requieran para su buen funcionamiento.</w:t>
+        <w:t>Participar en la recolección de datos y en los análisis correspondientes.</w:t>
       </w:r>
     </w:p>
     <w:p>
@@ -1788,7 +1788,7 @@
           <w:szCs w:val="22"/>
           <w:lang w:val="es-CO"/>
         </w:rPr>
-        <w:t>Cooperar en la ejecución de los proyectos asignados, poniendo a disposición los conocimientos alcanzados en proyectos anteriores del Instituto.</w:t>
+        <w:t>Coordinar las salidas de campo en las áreas de interés para la investigación del equipo y los proyectos de investigación.</w:t>
       </w:r>
     </w:p>
     <w:p>
@@ -1815,7 +1815,7 @@
           <w:szCs w:val="22"/>
           <w:lang w:val="es-CO"/>
         </w:rPr>
-        <w:t>Revisar los informes técnicos necesarios para dar cumplimiento al desarrollo de los proyectos en los cuales participe.</w:t>
+        <w:t>Elaborar informes y presentaciones sobre los resultados de la investigación.</w:t>
       </w:r>
     </w:p>
     <w:p>
@@ -1842,7 +1842,7 @@
           <w:szCs w:val="22"/>
           <w:lang w:val="es-CO"/>
         </w:rPr>
-        <w:t>Trabajar de manera articulada con las demás áreas del Instituto para el buen cumplimiento de los proyectos.</w:t>
+        <w:t>Analizar datos utilizando software estadístico y otras herramientas pertinentes.</w:t>
       </w:r>
     </w:p>
     <w:p>
@@ -1869,7 +1869,7 @@
           <w:szCs w:val="22"/>
           <w:lang w:val="es-CO"/>
         </w:rPr>
-        <w:t>Apoyar la definición de las agendas y espacios de trabajo requeridos para el correcto desarrollo de los proyectos en los que participe.</w:t>
+        <w:t>Desarrollar talleres y espacios de transferencia asociados a las investigaciones realizadas.</w:t>
       </w:r>
     </w:p>
     <w:p>
@@ -1896,108 +1896,7 @@
           <w:szCs w:val="22"/>
           <w:lang w:val="es-CO"/>
         </w:rPr>
-        <w:t>Las demás funciones relacionadas con el objeto del cargo.</w:t>
-      </w:r>
-    </w:p>
-    <w:p>
-      <w:pPr>
-        <w:jc w:val="both"/>
-        <w:rPr>
-          <w:rFonts w:ascii="Arial" w:hAnsi="Arial" w:cs="Arial"/>
-          <w:b/>
-          <w:sz w:val="22"/>
-          <w:szCs w:val="22"/>
-          <w:u w:val="single"/>
-          <w:lang w:val="es-CO"/>
-        </w:rPr>
-      </w:pPr>
-    </w:p>
-    <w:p>
-      <w:pPr>
-        <w:jc w:val="both"/>
-        <w:rPr>
-          <w:rFonts w:ascii="Arial" w:hAnsi="Arial" w:cs="Arial"/>
-          <w:sz w:val="22"/>
-          <w:szCs w:val="22"/>
-          <w:lang w:val="es-CO" w:eastAsia="es-MX"/>
-        </w:rPr>
-      </w:pPr>
-      <w:r>
-        <w:rPr>
-          <w:rFonts w:ascii="Arial" w:hAnsi="Arial" w:cs="Arial"/>
-          <w:b/>
-          <w:sz w:val="22"/>
-          <w:szCs w:val="22"/>
-          <w:u w:val="single"/>
-          <w:lang w:val="es-CO" w:eastAsia="es-MX"/>
-        </w:rPr>
-        <w:t>Resultados esperados (impacto del cargo)</w:t>
-      </w:r>
-      <w:r>
-        <w:rPr>
-          <w:rFonts w:ascii="Arial" w:hAnsi="Arial" w:cs="Arial"/>
-          <w:b/>
-          <w:sz w:val="22"/>
-          <w:szCs w:val="22"/>
-          <w:lang w:val="es-CO" w:eastAsia="es-MX"/>
-        </w:rPr>
-        <w:t>:</w:t>
-      </w:r>
-      <w:r>
-        <w:rPr>
-          <w:rFonts w:ascii="Arial" w:hAnsi="Arial" w:cs="Arial"/>
-          <w:sz w:val="22"/>
-          <w:szCs w:val="22"/>
-          <w:lang w:val="es-CO" w:eastAsia="es-MX"/>
-        </w:rPr>
-        <w:t xml:space="preserve"> </w:t>
-      </w:r>
-    </w:p>
-    <w:p>
-      <w:pPr>
-        <w:jc w:val="both"/>
-        <w:rPr>
-          <w:rFonts w:ascii="Arial" w:hAnsi="Arial" w:cs="Arial"/>
-          <w:sz w:val="22"/>
-          <w:szCs w:val="22"/>
-          <w:lang w:val="es-CO" w:eastAsia="es-MX"/>
-        </w:rPr>
-      </w:pPr>
-      <w:r>
-        <w:rPr>
-          <w:rFonts w:ascii="Arial" w:hAnsi="Arial" w:cs="Arial"/>
-          <w:sz w:val="22"/>
-          <w:szCs w:val="22"/>
-          <w:lang w:val="es-CO" w:eastAsia="es-MX"/>
-        </w:rPr>
-        <w:t>S</w:t>
-      </w:r>
-      <w:r>
-        <w:rPr>
-          <w:rFonts w:ascii="Arial" w:hAnsi="Arial" w:cs="Arial"/>
-          <w:sz w:val="22"/>
-          <w:szCs w:val="22"/>
-          <w:lang w:val="es-CO" w:eastAsia="es-MX"/>
-        </w:rPr>
-        <w:t>e describen cuáles son los aportes que el cargo dará al programa, proyecto o área que lo solicita, estos resultados deben tener una relación directa con la fuente que lo financia.</w:t>
-      </w:r>
-      <w:r>
-        <w:rPr>
-          <w:rFonts w:ascii="Arial" w:hAnsi="Arial" w:cs="Arial"/>
-          <w:sz w:val="22"/>
-          <w:szCs w:val="22"/>
-          <w:lang w:val="es-CO" w:eastAsia="es-MX"/>
-        </w:rPr>
-        <w:t xml:space="preserve"> </w:t>
-      </w:r>
-      <w:r>
-        <w:rPr>
-          <w:rFonts w:ascii="Arial" w:hAnsi="Arial" w:cs="Arial"/>
-          <w:sz w:val="22"/>
-          <w:szCs w:val="22"/>
-          <w:lang w:val="es-CO" w:eastAsia="es-MX"/>
-        </w:rPr>
-        <w:t>Ejemplo: Informes, documentos, reportes, bases de datos, artículos, archivos, entregables.</w:t>
+        <w:t>Apoyar la elaboración de propuestas de financiamiento para proyectos de investigación.</w:t>
       </w:r>
     </w:p>
     <w:p>
@@ -2024,7 +1923,7 @@
           <w:szCs w:val="22"/>
           <w:lang w:val="es-CO"/>
         </w:rPr>
-        <w:t>Informes técnicos de avance y final para el correcto cierre de los proyectos asignados, en cumplimiento de los compromisos con la fuente de financiación (ANH).</w:t>
+        <w:t>Apoyar técnica, administrativa y financieramente la(s) investigación(es) asignada(s), de conformidad con los instrumentos de planeación definidos por el Instituto.</w:t>
       </w:r>
     </w:p>
     <w:p>
@@ -2051,7 +1950,7 @@
           <w:szCs w:val="22"/>
           <w:lang w:val="es-CO"/>
         </w:rPr>
-        <w:t>Términos de referencia para la suscripción de los contratos de prestación de servicios de los profesionales requeridos para la ejecución de los convenios en los que participe.</w:t>
+        <w:t>Preparar artículos científicos, reportes técnicos y otros manuscritos que permitan divulgar los resultados de la investigación a múltiples audiencias.</w:t>
       </w:r>
     </w:p>
     <w:p>
@@ -2078,7 +1977,7 @@
           <w:szCs w:val="22"/>
           <w:lang w:val="es-CO"/>
         </w:rPr>
-        <w:t>Actas de las reuniones de seguimiento realizadas durante la ejecución de los proyectos asignados.</w:t>
+        <w:t>Participar en la elaboración de conceptos técnicos y posiciones institucionales en respuesta a requerimientos internos y externos.</w:t>
       </w:r>
     </w:p>
     <w:p>
@@ -2105,7 +2004,7 @@
           <w:szCs w:val="22"/>
           <w:lang w:val="es-CO"/>
         </w:rPr>
-        <w:t>Documento de observaciones a la revisión de los informes técnicos de los convenios en los que participe.</w:t>
+        <w:t>Colaborar con otros investigadores y personal de apoyo en proyectos de investigación.</w:t>
       </w:r>
     </w:p>
     <w:p>
@@ -2132,7 +2031,540 @@
           <w:szCs w:val="22"/>
           <w:lang w:val="es-CO"/>
         </w:rPr>
-        <w:t>Informes de viaje de los espacios de trabajo que requieran acompañamiento del Instituto.</w:t>
+        <w:t>Asegurar el cumplimiento de los protocolos y normas de seguridad establecidos para las actividades de investigación de campo.</w:t>
+      </w:r>
+    </w:p>
+    <w:p>
+      <w:pPr>
+        <w:pStyle w:val="Prrafodelista"/>
+        <w:numPr>
+          <w:ilvl w:val="0"/>
+          <w:numId w:val="2"/>
+        </w:numPr>
+        <w:jc w:val="both"/>
+        <w:rPr>
+          <w:rFonts w:ascii="Arial" w:hAnsi="Arial" w:cs="Arial"/>
+          <w:sz w:val="22"/>
+          <w:szCs w:val="22"/>
+          <w:lang w:val="es-CO"/>
+        </w:rPr>
+      </w:pPr>
+      <w:r>
+        <w:rPr>
+          <w:rFonts w:ascii="Arial" w:hAnsi="Arial" w:cs="Arial"/>
+          <w:b w:val="0"/>
+          <w:i w:val="0"/>
+          <w:sz w:val="22"/>
+          <w:szCs w:val="22"/>
+          <w:lang w:val="es-CO"/>
+        </w:rPr>
+        <w:t>Elaborar, revisar, divulgar y publicar documentos técnicos con los resultados de las investigaciones desarrolladas.</w:t>
+      </w:r>
+    </w:p>
+    <w:p>
+      <w:pPr>
+        <w:pStyle w:val="Prrafodelista"/>
+        <w:numPr>
+          <w:ilvl w:val="0"/>
+          <w:numId w:val="2"/>
+        </w:numPr>
+        <w:jc w:val="both"/>
+        <w:rPr>
+          <w:rFonts w:ascii="Arial" w:hAnsi="Arial" w:cs="Arial"/>
+          <w:sz w:val="22"/>
+          <w:szCs w:val="22"/>
+          <w:lang w:val="es-CO"/>
+        </w:rPr>
+      </w:pPr>
+      <w:r>
+        <w:rPr>
+          <w:rFonts w:ascii="Arial" w:hAnsi="Arial" w:cs="Arial"/>
+          <w:b w:val="0"/>
+          <w:i w:val="0"/>
+          <w:sz w:val="22"/>
+          <w:szCs w:val="22"/>
+          <w:lang w:val="es-CO"/>
+        </w:rPr>
+        <w:t>Contribuir a que los resultados de las investigaciones a su cargo se integren dentro del ciclo institucional de gestión del conocimiento.</w:t>
+      </w:r>
+    </w:p>
+    <w:p>
+      <w:pPr>
+        <w:pStyle w:val="Prrafodelista"/>
+        <w:numPr>
+          <w:ilvl w:val="0"/>
+          <w:numId w:val="2"/>
+        </w:numPr>
+        <w:jc w:val="both"/>
+        <w:rPr>
+          <w:rFonts w:ascii="Arial" w:hAnsi="Arial" w:cs="Arial"/>
+          <w:sz w:val="22"/>
+          <w:szCs w:val="22"/>
+          <w:lang w:val="es-CO"/>
+        </w:rPr>
+      </w:pPr>
+      <w:r>
+        <w:rPr>
+          <w:rFonts w:ascii="Arial" w:hAnsi="Arial" w:cs="Arial"/>
+          <w:b w:val="0"/>
+          <w:i w:val="0"/>
+          <w:sz w:val="22"/>
+          <w:szCs w:val="22"/>
+          <w:lang w:val="es-CO"/>
+        </w:rPr>
+        <w:t>Mantener actualizado el registro de producción científica en CvLAC – Minciencias, según los criterios definidos por el Instituto.</w:t>
+      </w:r>
+    </w:p>
+    <w:p>
+      <w:pPr>
+        <w:pStyle w:val="Prrafodelista"/>
+        <w:numPr>
+          <w:ilvl w:val="0"/>
+          <w:numId w:val="2"/>
+        </w:numPr>
+        <w:jc w:val="both"/>
+        <w:rPr>
+          <w:rFonts w:ascii="Arial" w:hAnsi="Arial" w:cs="Arial"/>
+          <w:sz w:val="22"/>
+          <w:szCs w:val="22"/>
+          <w:lang w:val="es-CO"/>
+        </w:rPr>
+      </w:pPr>
+      <w:r>
+        <w:rPr>
+          <w:rFonts w:ascii="Arial" w:hAnsi="Arial" w:cs="Arial"/>
+          <w:b w:val="0"/>
+          <w:i w:val="0"/>
+          <w:sz w:val="22"/>
+          <w:szCs w:val="22"/>
+          <w:lang w:val="es-CO"/>
+        </w:rPr>
+        <w:t>Realizar las supervisiones de contratos o acuerdos que se le deleguen, de manera diligente y siguiendo las políticas institucionales.</w:t>
+      </w:r>
+    </w:p>
+    <w:p>
+      <w:pPr>
+        <w:pStyle w:val="Prrafodelista"/>
+        <w:numPr>
+          <w:ilvl w:val="0"/>
+          <w:numId w:val="2"/>
+        </w:numPr>
+        <w:jc w:val="both"/>
+        <w:rPr>
+          <w:rFonts w:ascii="Arial" w:hAnsi="Arial" w:cs="Arial"/>
+          <w:sz w:val="22"/>
+          <w:szCs w:val="22"/>
+          <w:lang w:val="es-CO"/>
+        </w:rPr>
+      </w:pPr>
+      <w:r>
+        <w:rPr>
+          <w:rFonts w:ascii="Arial" w:hAnsi="Arial" w:cs="Arial"/>
+          <w:b w:val="0"/>
+          <w:i w:val="0"/>
+          <w:sz w:val="22"/>
+          <w:szCs w:val="22"/>
+          <w:lang w:val="es-CO"/>
+        </w:rPr>
+        <w:t>Representar al Instituto en las reuniones que se le deleguen.</w:t>
+      </w:r>
+    </w:p>
+    <w:p>
+      <w:pPr>
+        <w:pStyle w:val="Prrafodelista"/>
+        <w:numPr>
+          <w:ilvl w:val="0"/>
+          <w:numId w:val="2"/>
+        </w:numPr>
+        <w:jc w:val="both"/>
+        <w:rPr>
+          <w:rFonts w:ascii="Arial" w:hAnsi="Arial" w:cs="Arial"/>
+          <w:sz w:val="22"/>
+          <w:szCs w:val="22"/>
+          <w:lang w:val="es-CO"/>
+        </w:rPr>
+      </w:pPr>
+      <w:r>
+        <w:rPr>
+          <w:rFonts w:ascii="Arial" w:hAnsi="Arial" w:cs="Arial"/>
+          <w:b w:val="0"/>
+          <w:i w:val="0"/>
+          <w:sz w:val="22"/>
+          <w:szCs w:val="22"/>
+          <w:lang w:val="es-CO"/>
+        </w:rPr>
+        <w:t>Mantener estricta confidencialidad sobre los temas que conozca en el ejercicio de sus funciones.</w:t>
+      </w:r>
+    </w:p>
+    <w:p>
+      <w:pPr>
+        <w:pStyle w:val="Prrafodelista"/>
+        <w:numPr>
+          <w:ilvl w:val="0"/>
+          <w:numId w:val="2"/>
+        </w:numPr>
+        <w:jc w:val="both"/>
+        <w:rPr>
+          <w:rFonts w:ascii="Arial" w:hAnsi="Arial" w:cs="Arial"/>
+          <w:sz w:val="22"/>
+          <w:szCs w:val="22"/>
+          <w:lang w:val="es-CO"/>
+        </w:rPr>
+      </w:pPr>
+      <w:r>
+        <w:rPr>
+          <w:rFonts w:ascii="Arial" w:hAnsi="Arial" w:cs="Arial"/>
+          <w:b w:val="0"/>
+          <w:i w:val="0"/>
+          <w:sz w:val="22"/>
+          <w:szCs w:val="22"/>
+          <w:lang w:val="es-CO"/>
+        </w:rPr>
+        <w:t>Responder por los equipos y herramientas de oficina asignados, procurando su cuidado y buen uso.</w:t>
+      </w:r>
+    </w:p>
+    <w:p>
+      <w:pPr>
+        <w:pStyle w:val="Prrafodelista"/>
+        <w:numPr>
+          <w:ilvl w:val="0"/>
+          <w:numId w:val="2"/>
+        </w:numPr>
+        <w:jc w:val="both"/>
+        <w:rPr>
+          <w:rFonts w:ascii="Arial" w:hAnsi="Arial" w:cs="Arial"/>
+          <w:sz w:val="22"/>
+          <w:szCs w:val="22"/>
+          <w:lang w:val="es-CO"/>
+        </w:rPr>
+      </w:pPr>
+      <w:r>
+        <w:rPr>
+          <w:rFonts w:ascii="Arial" w:hAnsi="Arial" w:cs="Arial"/>
+          <w:b w:val="0"/>
+          <w:i w:val="0"/>
+          <w:sz w:val="22"/>
+          <w:szCs w:val="22"/>
+          <w:lang w:val="es-CO"/>
+        </w:rPr>
+        <w:t>Las demás funciones relacionadas con el objeto del cargo.</w:t>
+      </w:r>
+    </w:p>
+    <w:p>
+      <w:pPr>
+        <w:jc w:val="both"/>
+        <w:rPr>
+          <w:rFonts w:ascii="Arial" w:hAnsi="Arial" w:cs="Arial"/>
+          <w:b/>
+          <w:sz w:val="22"/>
+          <w:szCs w:val="22"/>
+          <w:u w:val="single"/>
+          <w:lang w:val="es-CO"/>
+        </w:rPr>
+      </w:pPr>
+    </w:p>
+    <w:p>
+      <w:pPr>
+        <w:jc w:val="both"/>
+        <w:rPr>
+          <w:rFonts w:ascii="Arial" w:hAnsi="Arial" w:cs="Arial"/>
+          <w:sz w:val="22"/>
+          <w:szCs w:val="22"/>
+          <w:lang w:val="es-CO" w:eastAsia="es-MX"/>
+        </w:rPr>
+      </w:pPr>
+      <w:r>
+        <w:rPr>
+          <w:rFonts w:ascii="Arial" w:hAnsi="Arial" w:cs="Arial"/>
+          <w:b/>
+          <w:sz w:val="22"/>
+          <w:szCs w:val="22"/>
+          <w:u w:val="single"/>
+          <w:lang w:val="es-CO" w:eastAsia="es-MX"/>
+        </w:rPr>
+        <w:t>Resultados esperados (impacto del cargo)</w:t>
+      </w:r>
+      <w:r>
+        <w:rPr>
+          <w:rFonts w:ascii="Arial" w:hAnsi="Arial" w:cs="Arial"/>
+          <w:b/>
+          <w:sz w:val="22"/>
+          <w:szCs w:val="22"/>
+          <w:lang w:val="es-CO" w:eastAsia="es-MX"/>
+        </w:rPr>
+        <w:t>:</w:t>
+      </w:r>
+      <w:r>
+        <w:rPr>
+          <w:rFonts w:ascii="Arial" w:hAnsi="Arial" w:cs="Arial"/>
+          <w:sz w:val="22"/>
+          <w:szCs w:val="22"/>
+          <w:lang w:val="es-CO" w:eastAsia="es-MX"/>
+        </w:rPr>
+        <w:t xml:space="preserve"> </w:t>
+      </w:r>
+    </w:p>
+    <w:p>
+      <w:pPr>
+        <w:jc w:val="both"/>
+        <w:rPr>
+          <w:rFonts w:ascii="Arial" w:hAnsi="Arial" w:cs="Arial"/>
+          <w:sz w:val="22"/>
+          <w:szCs w:val="22"/>
+          <w:lang w:val="es-CO" w:eastAsia="es-MX"/>
+        </w:rPr>
+      </w:pPr>
+      <w:r>
+        <w:rPr>
+          <w:rFonts w:ascii="Arial" w:hAnsi="Arial" w:cs="Arial"/>
+          <w:sz w:val="22"/>
+          <w:szCs w:val="22"/>
+          <w:lang w:val="es-CO" w:eastAsia="es-MX"/>
+        </w:rPr>
+        <w:t>S</w:t>
+      </w:r>
+      <w:r>
+        <w:rPr>
+          <w:rFonts w:ascii="Arial" w:hAnsi="Arial" w:cs="Arial"/>
+          <w:sz w:val="22"/>
+          <w:szCs w:val="22"/>
+          <w:lang w:val="es-CO" w:eastAsia="es-MX"/>
+        </w:rPr>
+        <w:t>e describen cuáles son los aportes que el cargo dará al programa, proyecto o área que lo solicita, estos resultados deben tener una relación directa con la fuente que lo financia.</w:t>
+      </w:r>
+      <w:r>
+        <w:rPr>
+          <w:rFonts w:ascii="Arial" w:hAnsi="Arial" w:cs="Arial"/>
+          <w:sz w:val="22"/>
+          <w:szCs w:val="22"/>
+          <w:lang w:val="es-CO" w:eastAsia="es-MX"/>
+        </w:rPr>
+        <w:t xml:space="preserve"> </w:t>
+      </w:r>
+      <w:r>
+        <w:rPr>
+          <w:rFonts w:ascii="Arial" w:hAnsi="Arial" w:cs="Arial"/>
+          <w:sz w:val="22"/>
+          <w:szCs w:val="22"/>
+          <w:lang w:val="es-CO" w:eastAsia="es-MX"/>
+        </w:rPr>
+        <w:t>Ejemplo: Informes, documentos, reportes, bases de datos, artículos, archivos, entregables.</w:t>
+      </w:r>
+    </w:p>
+    <w:p>
+      <w:pPr>
+        <w:pStyle w:val="Prrafodelista"/>
+        <w:numPr>
+          <w:ilvl w:val="0"/>
+          <w:numId w:val="2"/>
+        </w:numPr>
+        <w:jc w:val="both"/>
+        <w:rPr>
+          <w:rFonts w:ascii="Arial" w:hAnsi="Arial" w:cs="Arial"/>
+          <w:sz w:val="22"/>
+          <w:szCs w:val="22"/>
+          <w:lang w:val="es-CO"/>
+        </w:rPr>
+      </w:pPr>
+      <w:r>
+        <w:rPr>
+          <w:rFonts w:ascii="Arial" w:hAnsi="Arial" w:cs="Arial"/>
+          <w:b w:val="0"/>
+          <w:i w:val="0"/>
+          <w:sz w:val="22"/>
+          <w:szCs w:val="22"/>
+          <w:lang w:val="es-CO"/>
+        </w:rPr>
+        <w:t>Plan de trabajo y cronograma de las actividades de investigación asignadas en el proyecto ANH.</w:t>
+      </w:r>
+    </w:p>
+    <w:p>
+      <w:pPr>
+        <w:pStyle w:val="Prrafodelista"/>
+        <w:numPr>
+          <w:ilvl w:val="0"/>
+          <w:numId w:val="2"/>
+        </w:numPr>
+        <w:jc w:val="both"/>
+        <w:rPr>
+          <w:rFonts w:ascii="Arial" w:hAnsi="Arial" w:cs="Arial"/>
+          <w:sz w:val="22"/>
+          <w:szCs w:val="22"/>
+          <w:lang w:val="es-CO"/>
+        </w:rPr>
+      </w:pPr>
+      <w:r>
+        <w:rPr>
+          <w:rFonts w:ascii="Arial" w:hAnsi="Arial" w:cs="Arial"/>
+          <w:b w:val="0"/>
+          <w:i w:val="0"/>
+          <w:sz w:val="22"/>
+          <w:szCs w:val="22"/>
+          <w:lang w:val="es-CO"/>
+        </w:rPr>
+        <w:t>Informes técnicos de avance y final, con los resultados de la investigación, conforme a los compromisos con la fuente de financiación (ANH).</w:t>
+      </w:r>
+    </w:p>
+    <w:p>
+      <w:pPr>
+        <w:pStyle w:val="Prrafodelista"/>
+        <w:numPr>
+          <w:ilvl w:val="0"/>
+          <w:numId w:val="2"/>
+        </w:numPr>
+        <w:jc w:val="both"/>
+        <w:rPr>
+          <w:rFonts w:ascii="Arial" w:hAnsi="Arial" w:cs="Arial"/>
+          <w:sz w:val="22"/>
+          <w:szCs w:val="22"/>
+          <w:lang w:val="es-CO"/>
+        </w:rPr>
+      </w:pPr>
+      <w:r>
+        <w:rPr>
+          <w:rFonts w:ascii="Arial" w:hAnsi="Arial" w:cs="Arial"/>
+          <w:b w:val="0"/>
+          <w:i w:val="0"/>
+          <w:sz w:val="22"/>
+          <w:szCs w:val="22"/>
+          <w:lang w:val="es-CO"/>
+        </w:rPr>
+        <w:t>Bases de datos depuradas y estructuradas de la información levantada en campo y laboratorio, con sus análisis estadísticos.</w:t>
+      </w:r>
+    </w:p>
+    <w:p>
+      <w:pPr>
+        <w:pStyle w:val="Prrafodelista"/>
+        <w:numPr>
+          <w:ilvl w:val="0"/>
+          <w:numId w:val="2"/>
+        </w:numPr>
+        <w:jc w:val="both"/>
+        <w:rPr>
+          <w:rFonts w:ascii="Arial" w:hAnsi="Arial" w:cs="Arial"/>
+          <w:sz w:val="22"/>
+          <w:szCs w:val="22"/>
+          <w:lang w:val="es-CO"/>
+        </w:rPr>
+      </w:pPr>
+      <w:r>
+        <w:rPr>
+          <w:rFonts w:ascii="Arial" w:hAnsi="Arial" w:cs="Arial"/>
+          <w:b w:val="0"/>
+          <w:i w:val="0"/>
+          <w:sz w:val="22"/>
+          <w:szCs w:val="22"/>
+          <w:lang w:val="es-CO"/>
+        </w:rPr>
+        <w:t>Informes de salidas de campo, en cumplimiento de los protocolos de seguridad del Instituto.</w:t>
+      </w:r>
+    </w:p>
+    <w:p>
+      <w:pPr>
+        <w:pStyle w:val="Prrafodelista"/>
+        <w:numPr>
+          <w:ilvl w:val="0"/>
+          <w:numId w:val="2"/>
+        </w:numPr>
+        <w:jc w:val="both"/>
+        <w:rPr>
+          <w:rFonts w:ascii="Arial" w:hAnsi="Arial" w:cs="Arial"/>
+          <w:sz w:val="22"/>
+          <w:szCs w:val="22"/>
+          <w:lang w:val="es-CO"/>
+        </w:rPr>
+      </w:pPr>
+      <w:r>
+        <w:rPr>
+          <w:rFonts w:ascii="Arial" w:hAnsi="Arial" w:cs="Arial"/>
+          <w:b w:val="0"/>
+          <w:i w:val="0"/>
+          <w:sz w:val="22"/>
+          <w:szCs w:val="22"/>
+          <w:lang w:val="es-CO"/>
+        </w:rPr>
+        <w:t>Documentos técnicos, manuscritos o artículos científicos que divulguen los resultados de la investigación.</w:t>
+      </w:r>
+    </w:p>
+    <w:p>
+      <w:pPr>
+        <w:pStyle w:val="Prrafodelista"/>
+        <w:numPr>
+          <w:ilvl w:val="0"/>
+          <w:numId w:val="2"/>
+        </w:numPr>
+        <w:jc w:val="both"/>
+        <w:rPr>
+          <w:rFonts w:ascii="Arial" w:hAnsi="Arial" w:cs="Arial"/>
+          <w:sz w:val="22"/>
+          <w:szCs w:val="22"/>
+          <w:lang w:val="es-CO"/>
+        </w:rPr>
+      </w:pPr>
+      <w:r>
+        <w:rPr>
+          <w:rFonts w:ascii="Arial" w:hAnsi="Arial" w:cs="Arial"/>
+          <w:b w:val="0"/>
+          <w:i w:val="0"/>
+          <w:sz w:val="22"/>
+          <w:szCs w:val="22"/>
+          <w:lang w:val="es-CO"/>
+        </w:rPr>
+        <w:t>Memorias de talleres y espacios de transferencia de conocimiento realizados.</w:t>
+      </w:r>
+    </w:p>
+    <w:p>
+      <w:pPr>
+        <w:pStyle w:val="Prrafodelista"/>
+        <w:numPr>
+          <w:ilvl w:val="0"/>
+          <w:numId w:val="2"/>
+        </w:numPr>
+        <w:jc w:val="both"/>
+        <w:rPr>
+          <w:rFonts w:ascii="Arial" w:hAnsi="Arial" w:cs="Arial"/>
+          <w:sz w:val="22"/>
+          <w:szCs w:val="22"/>
+          <w:lang w:val="es-CO"/>
+        </w:rPr>
+      </w:pPr>
+      <w:r>
+        <w:rPr>
+          <w:rFonts w:ascii="Arial" w:hAnsi="Arial" w:cs="Arial"/>
+          <w:b w:val="0"/>
+          <w:i w:val="0"/>
+          <w:sz w:val="22"/>
+          <w:szCs w:val="22"/>
+          <w:lang w:val="es-CO"/>
+        </w:rPr>
+        <w:t>Términos de referencia e informes de supervisión de los contratos o acuerdos delegados.</w:t>
+      </w:r>
+    </w:p>
+    <w:p>
+      <w:pPr>
+        <w:pStyle w:val="Prrafodelista"/>
+        <w:numPr>
+          <w:ilvl w:val="0"/>
+          <w:numId w:val="2"/>
+        </w:numPr>
+        <w:jc w:val="both"/>
+        <w:rPr>
+          <w:rFonts w:ascii="Arial" w:hAnsi="Arial" w:cs="Arial"/>
+          <w:sz w:val="22"/>
+          <w:szCs w:val="22"/>
+          <w:lang w:val="es-CO"/>
+        </w:rPr>
+      </w:pPr>
+      <w:r>
+        <w:rPr>
+          <w:rFonts w:ascii="Arial" w:hAnsi="Arial" w:cs="Arial"/>
+          <w:b w:val="0"/>
+          <w:i w:val="0"/>
+          <w:sz w:val="22"/>
+          <w:szCs w:val="22"/>
+          <w:lang w:val="es-CO"/>
+        </w:rPr>
+        <w:t>Registro actualizado de la producción científica en CvLAC – Minciencias.</w:t>
       </w:r>
     </w:p>
     <w:p>

</xml_diff>